<commit_message>
remove program byline + docx author metadata per user directive (authorship framing to be written by owner later)
</commit_message>
<xml_diff>
--- a/paper/MEGA27-23b-50p-part1.docx
+++ b/paper/MEGA27-23b-50p-part1.docx
@@ -9,14 +9,6 @@
       </w:pPr>
       <w:r>
         <w:t>A Constraint-Guaranteed DNA Data Storage Codec with Block-Bounded Error Propagation, and a Flux-Balance Theory of Energy Reallocation in a Replication-Frozen Cyborg Cell</w:t>
-      </w:r>
-    </w:p>
-    <w:p>
-      <w:pPr>
-        <w:jc w:val="center"/>
-      </w:pPr>
-      <w:r>
-        <w:t>MEGA-PROGRAM-27, Item 23b - computational biology research lane</w:t>
       </w:r>
     </w:p>
     <w:p>

</xml_diff>